<commit_message>
Update Bill Summary with user's exact custom items: Printing 2500, Mic 4000, Transport 3000, Camera 5500
</commit_message>
<xml_diff>
--- a/Final_Submission_Pack/2_Bill_Summary.docx
+++ b/Final_Submission_Pack/2_Bill_Summary.docx
@@ -219,7 +219,7 @@
                 <w:rFonts w:ascii="Times New Roman" w:hAnsi="Times New Roman"/>
                 <w:color w:val="000000"/>
               </w:rPr>
-              <w:t>15/06/2026</w:t>
+              <w:t>10/06/2026</w:t>
             </w:r>
           </w:p>
         </w:tc>
@@ -239,7 +239,7 @@
                 <w:rFonts w:ascii="Times New Roman" w:hAnsi="Times New Roman"/>
                 <w:color w:val="000000"/>
               </w:rPr>
-              <w:t>1TB External High-Speed SSD (Model &amp; Journey Video Backup)</w:t>
+              <w:t>6x3ft Roll-Up Standee &amp; Hardbound Reports Printing</w:t>
             </w:r>
           </w:p>
         </w:tc>
@@ -259,7 +259,7 @@
                 <w:rFonts w:ascii="Times New Roman" w:hAnsi="Times New Roman"/>
                 <w:color w:val="000000"/>
               </w:rPr>
-              <w:t>Rs. 6,500.00</w:t>
+              <w:t>Rs. 2,500.00</w:t>
             </w:r>
           </w:p>
         </w:tc>
@@ -321,7 +321,7 @@
                 <w:rFonts w:ascii="Times New Roman" w:hAnsi="Times New Roman"/>
                 <w:color w:val="000000"/>
               </w:rPr>
-              <w:t>22/06/2026</w:t>
+              <w:t>18/06/2026</w:t>
             </w:r>
           </w:p>
         </w:tc>
@@ -341,7 +341,7 @@
                 <w:rFonts w:ascii="Times New Roman" w:hAnsi="Times New Roman"/>
                 <w:color w:val="000000"/>
               </w:rPr>
-              <w:t>6x3ft Roll-Up Standee &amp; 3 Hardbound Project Reports Printing</w:t>
+              <w:t>Wireless USB Microphone &amp; Presenter (Voice AI Demo)</w:t>
             </w:r>
           </w:p>
         </w:tc>
@@ -361,7 +361,7 @@
                 <w:rFonts w:ascii="Times New Roman" w:hAnsi="Times New Roman"/>
                 <w:color w:val="000000"/>
               </w:rPr>
-              <w:t>Rs. 4,500.00</w:t>
+              <w:t>Rs. 4,000.00</w:t>
             </w:r>
           </w:p>
         </w:tc>
@@ -423,7 +423,7 @@
                 <w:rFonts w:ascii="Times New Roman" w:hAnsi="Times New Roman"/>
                 <w:color w:val="000000"/>
               </w:rPr>
-              <w:t>05/07/2026</w:t>
+              <w:t>25/06/2026</w:t>
             </w:r>
           </w:p>
         </w:tc>
@@ -443,7 +443,7 @@
                 <w:rFonts w:ascii="Times New Roman" w:hAnsi="Times New Roman"/>
                 <w:color w:val="000000"/>
               </w:rPr>
-              <w:t>Wireless USB Microphone &amp; Presenter (Voice AI Stage Demo)</w:t>
+              <w:t>Regional Review Evaluation &amp; Team Logistics Transport</w:t>
             </w:r>
           </w:p>
         </w:tc>
@@ -463,7 +463,109 @@
                 <w:rFonts w:ascii="Times New Roman" w:hAnsi="Times New Roman"/>
                 <w:color w:val="000000"/>
               </w:rPr>
-              <w:t>Rs. 4,000.00</w:t>
+              <w:t>Rs. 3,000.00</w:t>
+            </w:r>
+          </w:p>
+        </w:tc>
+      </w:tr>
+      <w:tr>
+        <w:tc>
+          <w:tcPr>
+            <w:tcW w:type="dxa" w:w="1728"/>
+            <w:tcBorders>
+              <w:top w:val="single" w:sz="4" w:space="0" w:color="000000"/>
+              <w:left w:val="single" w:sz="4" w:space="0" w:color="000000"/>
+              <w:bottom w:val="single" w:sz="4" w:space="0" w:color="000000"/>
+              <w:right w:val="single" w:sz="4" w:space="0" w:color="000000"/>
+            </w:tcBorders>
+          </w:tcPr>
+          <w:p>
+            <w:r>
+              <w:rPr>
+                <w:rFonts w:ascii="Times New Roman" w:hAnsi="Times New Roman"/>
+                <w:color w:val="000000"/>
+              </w:rPr>
+              <w:t>4</w:t>
+            </w:r>
+          </w:p>
+        </w:tc>
+        <w:tc>
+          <w:tcPr>
+            <w:tcW w:type="dxa" w:w="1728"/>
+            <w:tcBorders>
+              <w:top w:val="single" w:sz="4" w:space="0" w:color="000000"/>
+              <w:left w:val="single" w:sz="4" w:space="0" w:color="000000"/>
+              <w:bottom w:val="single" w:sz="4" w:space="0" w:color="000000"/>
+              <w:right w:val="single" w:sz="4" w:space="0" w:color="000000"/>
+            </w:tcBorders>
+          </w:tcPr>
+          <w:p>
+            <w:r>
+              <w:rPr>
+                <w:rFonts w:ascii="Times New Roman" w:hAnsi="Times New Roman"/>
+                <w:color w:val="000000"/>
+              </w:rPr>
+              <w:t>INV-2026-04</w:t>
+            </w:r>
+          </w:p>
+        </w:tc>
+        <w:tc>
+          <w:tcPr>
+            <w:tcW w:type="dxa" w:w="1728"/>
+            <w:tcBorders>
+              <w:top w:val="single" w:sz="4" w:space="0" w:color="000000"/>
+              <w:left w:val="single" w:sz="4" w:space="0" w:color="000000"/>
+              <w:bottom w:val="single" w:sz="4" w:space="0" w:color="000000"/>
+              <w:right w:val="single" w:sz="4" w:space="0" w:color="000000"/>
+            </w:tcBorders>
+          </w:tcPr>
+          <w:p>
+            <w:r>
+              <w:rPr>
+                <w:rFonts w:ascii="Times New Roman" w:hAnsi="Times New Roman"/>
+                <w:color w:val="000000"/>
+              </w:rPr>
+              <w:t>02/07/2026</w:t>
+            </w:r>
+          </w:p>
+        </w:tc>
+        <w:tc>
+          <w:tcPr>
+            <w:tcW w:type="dxa" w:w="1728"/>
+            <w:tcBorders>
+              <w:top w:val="single" w:sz="4" w:space="0" w:color="000000"/>
+              <w:left w:val="single" w:sz="4" w:space="0" w:color="000000"/>
+              <w:bottom w:val="single" w:sz="4" w:space="0" w:color="000000"/>
+              <w:right w:val="single" w:sz="4" w:space="0" w:color="000000"/>
+            </w:tcBorders>
+          </w:tcPr>
+          <w:p>
+            <w:r>
+              <w:rPr>
+                <w:rFonts w:ascii="Times New Roman" w:hAnsi="Times New Roman"/>
+                <w:color w:val="000000"/>
+              </w:rPr>
+              <w:t>HD Web Camera (Affective Vision &amp; Journey Video)</w:t>
+            </w:r>
+          </w:p>
+        </w:tc>
+        <w:tc>
+          <w:tcPr>
+            <w:tcW w:type="dxa" w:w="1728"/>
+            <w:tcBorders>
+              <w:top w:val="single" w:sz="4" w:space="0" w:color="000000"/>
+              <w:left w:val="single" w:sz="4" w:space="0" w:color="000000"/>
+              <w:bottom w:val="single" w:sz="4" w:space="0" w:color="000000"/>
+              <w:right w:val="single" w:sz="4" w:space="0" w:color="000000"/>
+            </w:tcBorders>
+          </w:tcPr>
+          <w:p>
+            <w:r>
+              <w:rPr>
+                <w:rFonts w:ascii="Times New Roman" w:hAnsi="Times New Roman"/>
+                <w:color w:val="000000"/>
+              </w:rPr>
+              <w:t>Rs. 5,500.00</w:t>
             </w:r>
           </w:p>
         </w:tc>

</xml_diff>